<commit_message>
Diagrammerne Aktivitets og Use case diagrammerne færdig
</commit_message>
<xml_diff>
--- a/Filer/kravspecifikationen.docx
+++ b/Filer/kravspecifikationen.docx
@@ -5,109 +5,123 @@
     <w:p>
       <w:pPr>
         <w:pStyle w:val="Titel"/>
-        <w:rPr>
-          <w:lang w:val="da-DK"/>
-        </w:rPr>
       </w:pPr>
       <w:r>
-        <w:rPr>
-          <w:lang w:val="da-DK"/>
-        </w:rPr>
-        <w:t>Kravspecifikation – Kløverly</w:t>
+        <w:t xml:space="preserve">Kravspecifikation – </w:t>
       </w:r>
+      <w:proofErr w:type="spellStart"/>
+      <w:r>
+        <w:t>Kløverly</w:t>
+      </w:r>
+      <w:proofErr w:type="spellEnd"/>
     </w:p>
     <w:p>
       <w:pPr>
         <w:pStyle w:val="Undertitel"/>
-        <w:rPr>
-          <w:lang w:val="da-DK"/>
-        </w:rPr>
       </w:pPr>
       <w:r>
-        <w:rPr>
-          <w:lang w:val="da-DK"/>
-        </w:rPr>
-        <w:t>SEP1 reeksamen  ·  Chadi og Mehmet</w:t>
+        <w:t xml:space="preserve">SEP1 </w:t>
+      </w:r>
+      <w:proofErr w:type="gramStart"/>
+      <w:r>
+        <w:t>reeksamen  ·</w:t>
+      </w:r>
+      <w:proofErr w:type="gramEnd"/>
+      <w:r>
+        <w:t xml:space="preserve">  Chadi og Mehmet</w:t>
       </w:r>
     </w:p>
     <w:p>
-      <w:pPr>
-        <w:rPr>
-          <w:lang w:val="da-DK"/>
-        </w:rPr>
-      </w:pPr>
       <w:r>
-        <w:rPr>
-          <w:lang w:val="da-DK"/>
-        </w:rPr>
-        <w:t>Dette dokument beskriver kravene til vores fælles Kløverly-system. Kravene er udarbejdet med udgangspunkt i Kløverly-casen, vores brainstorm og idéer fra begge tidligere projekter. Vi bruger krav-ID’erne til at skabe sammenhæng mellem use cases, design, kode og test.</w:t>
+        <w:t xml:space="preserve">Dette dokument beskriver kravene til vores fælles </w:t>
+      </w:r>
+      <w:proofErr w:type="spellStart"/>
+      <w:r>
+        <w:t>Kløverly</w:t>
+      </w:r>
+      <w:proofErr w:type="spellEnd"/>
+      <w:r>
+        <w:t xml:space="preserve">-system. Kravene er udarbejdet med udgangspunkt i </w:t>
+      </w:r>
+      <w:proofErr w:type="spellStart"/>
+      <w:r>
+        <w:t>Kløverly</w:t>
+      </w:r>
+      <w:proofErr w:type="spellEnd"/>
+      <w:r>
+        <w:t>-casen, vores brainstorm og idéer fra begge tidligere projekter. Vi bruger krav-</w:t>
+      </w:r>
+      <w:proofErr w:type="spellStart"/>
+      <w:r>
+        <w:t>ID’erne</w:t>
+      </w:r>
+      <w:proofErr w:type="spellEnd"/>
+      <w:r>
+        <w:t xml:space="preserve"> til at skabe sammenhæng mellem </w:t>
+      </w:r>
+      <w:proofErr w:type="spellStart"/>
+      <w:r>
+        <w:t>use</w:t>
+      </w:r>
+      <w:proofErr w:type="spellEnd"/>
+      <w:r>
+        <w:t xml:space="preserve"> cases, design, kode og test.</w:t>
       </w:r>
     </w:p>
     <w:p>
       <w:pPr>
         <w:pStyle w:val="Overskrift1"/>
-        <w:rPr>
-          <w:lang w:val="da-DK"/>
-        </w:rPr>
       </w:pPr>
       <w:r>
-        <w:rPr>
-          <w:lang w:val="da-DK"/>
-        </w:rPr>
         <w:t>1. Formål og afgrænsning</w:t>
       </w:r>
     </w:p>
     <w:p>
-      <w:pPr>
-        <w:rPr>
-          <w:lang w:val="da-DK"/>
-        </w:rPr>
-      </w:pPr>
       <w:r>
-        <w:rPr>
-          <w:lang w:val="da-DK"/>
-        </w:rPr>
-        <w:t>Vi vil udvikle et lokalt enkeltbrugersystem, som Grønne Bob eller Don bruger til at administrere beboere, opgaver og point i Kløverly. Beboerne har ikke selv adgang til administrationsprogrammet. Vi laver også en informationshjemmeside om landsbyen med inspiration til grønne handlinger.</w:t>
+        <w:t xml:space="preserve">Vi vil udvikle et lokalt enkeltbrugersystem, som Grønne Bob eller Don bruger til at administrere beboere, opgaver og point i </w:t>
+      </w:r>
+      <w:proofErr w:type="spellStart"/>
+      <w:r>
+        <w:t>Kløverly</w:t>
+      </w:r>
+      <w:proofErr w:type="spellEnd"/>
+      <w:r>
+        <w:t>. Beboerne har ikke selv adgang til administrationsprogrammet. Vi laver også en informationshjemmeside om landsbyen med inspiration til grønne handlinger.</w:t>
       </w:r>
     </w:p>
     <w:p>
-      <w:pPr>
-        <w:rPr>
-          <w:lang w:val="da-DK"/>
-        </w:rPr>
-      </w:pPr>
       <w:r>
-        <w:rPr>
-          <w:lang w:val="da-DK"/>
-        </w:rPr>
-        <w:t>Systemet skal skelne mellem grønne tiltag, fællesopgaver og bytteopgaver. Grønne tiltag bidrager til fællespuljen, fællesopgaver giver personlige point, og bytteopgaver bruger personlige point. Personlige point må ikke blive negative. Alle funktioner nedenfor er valgt som krav til den nye løsning og skal derfor indgå i vores videre design, implementering og test.</w:t>
+        <w:t xml:space="preserve">Systemet skal skelne mellem grønne tiltag, fællesopgaver og bytteopgaver. Når grønne tiltag afsluttes, bidrager de til fællespuljen. Når fællesopgaver afsluttes, får udføreren personlige point. Bytteopgaver bruger personlige point fra bestilleren og overfører dem til udføreren ved afslutning. </w:t>
+      </w:r>
+      <w:r>
+        <w:t>Personlige point må ikke blive negative</w:t>
+      </w:r>
+      <w:r>
+        <w:t>.</w:t>
+      </w:r>
+      <w:r>
+        <w:t xml:space="preserve"> </w:t>
       </w:r>
     </w:p>
     <w:p>
       <w:pPr>
         <w:pStyle w:val="Overskrift1"/>
-        <w:rPr>
-          <w:lang w:val="da-DK"/>
-        </w:rPr>
       </w:pPr>
       <w:r>
-        <w:rPr>
-          <w:lang w:val="da-DK"/>
-        </w:rPr>
         <w:t>2. Funktionelle krav (FR)</w:t>
       </w:r>
     </w:p>
     <w:p>
-      <w:pPr>
-        <w:rPr>
-          <w:lang w:val="da-DK"/>
-        </w:rPr>
-      </w:pPr>
       <w:r>
-        <w:rPr>
-          <w:lang w:val="da-DK"/>
-        </w:rPr>
-        <w:t>En bruger af administrationsprogrammet er Grønne Bob eller Don. Kravene er nummereret, så de kan kobles til use cases og test.</w:t>
+        <w:t xml:space="preserve">En bruger af administrationsprogrammet er Grønne Bob eller Don. Kravene er nummereret, så de kan kobles til </w:t>
+      </w:r>
+      <w:proofErr w:type="spellStart"/>
+      <w:r>
+        <w:t>use</w:t>
+      </w:r>
+      <w:proofErr w:type="spellEnd"/>
+      <w:r>
+        <w:t xml:space="preserve"> cases og test.</w:t>
       </w:r>
     </w:p>
     <w:tbl>
@@ -194,14 +208,10 @@
           <w:p>
             <w:pPr>
               <w:spacing w:before="40" w:after="40"/>
-              <w:rPr>
-                <w:lang w:val="da-DK"/>
-              </w:rPr>
             </w:pPr>
             <w:r>
               <w:rPr>
                 <w:sz w:val="18"/>
-                <w:lang w:val="da-DK"/>
               </w:rPr>
               <w:t>Oprette en beboer med nødvendige oplysninger.</w:t>
             </w:r>
@@ -238,14 +248,10 @@
           <w:p>
             <w:pPr>
               <w:spacing w:before="40" w:after="40"/>
-              <w:rPr>
-                <w:lang w:val="da-DK"/>
-              </w:rPr>
             </w:pPr>
             <w:r>
               <w:rPr>
                 <w:sz w:val="18"/>
-                <w:lang w:val="da-DK"/>
               </w:rPr>
               <w:t>Redigere oplysninger om en eksisterende beboer.</w:t>
             </w:r>
@@ -282,14 +288,10 @@
           <w:p>
             <w:pPr>
               <w:spacing w:before="40" w:after="40"/>
-              <w:rPr>
-                <w:lang w:val="da-DK"/>
-              </w:rPr>
             </w:pPr>
             <w:r>
               <w:rPr>
                 <w:sz w:val="18"/>
-                <w:lang w:val="da-DK"/>
               </w:rPr>
               <w:t>Slette en beboer efter bekræftelse.</w:t>
             </w:r>
@@ -326,14 +328,10 @@
           <w:p>
             <w:pPr>
               <w:spacing w:before="40" w:after="40"/>
-              <w:rPr>
-                <w:lang w:val="da-DK"/>
-              </w:rPr>
             </w:pPr>
             <w:r>
               <w:rPr>
                 <w:sz w:val="18"/>
-                <w:lang w:val="da-DK"/>
               </w:rPr>
               <w:t>Vise en oversigt over registrerede beboere.</w:t>
             </w:r>
@@ -370,16 +368,12 @@
           <w:p>
             <w:pPr>
               <w:spacing w:before="40" w:after="40"/>
-              <w:rPr>
-                <w:lang w:val="da-DK"/>
-              </w:rPr>
             </w:pPr>
             <w:r>
               <w:rPr>
                 <w:sz w:val="18"/>
-                <w:lang w:val="da-DK"/>
               </w:rPr>
-              <w:t>Oprette en opgave til en valgt beboer med beskrivelse, dato og point.</w:t>
+              <w:t>Oprette en opgave med type, beskrivelse, dato og point. Ved en bytteopgave vælges en beboer som bestiller.</w:t>
             </w:r>
           </w:p>
         </w:tc>
@@ -454,14 +448,10 @@
           <w:p>
             <w:pPr>
               <w:spacing w:before="40" w:after="40"/>
-              <w:rPr>
-                <w:lang w:val="da-DK"/>
-              </w:rPr>
             </w:pPr>
             <w:r>
               <w:rPr>
                 <w:sz w:val="18"/>
-                <w:lang w:val="da-DK"/>
               </w:rPr>
               <w:t>Slette en opgave efter bekræftelse.</w:t>
             </w:r>
@@ -498,16 +488,12 @@
           <w:p>
             <w:pPr>
               <w:spacing w:before="40" w:after="40"/>
-              <w:rPr>
-                <w:lang w:val="da-DK"/>
-              </w:rPr>
             </w:pPr>
             <w:r>
               <w:rPr>
                 <w:sz w:val="18"/>
-                <w:lang w:val="da-DK"/>
               </w:rPr>
-              <w:t>Vise opgaver, der er knyttet til en valgt beboer.</w:t>
+              <w:t>Vise en samlet oversigt over aktive opgaver med type, dato, beskrivelse og point.</w:t>
             </w:r>
           </w:p>
         </w:tc>
@@ -542,14 +528,10 @@
           <w:p>
             <w:pPr>
               <w:spacing w:before="40" w:after="40"/>
-              <w:rPr>
-                <w:lang w:val="da-DK"/>
-              </w:rPr>
             </w:pPr>
             <w:r>
               <w:rPr>
                 <w:sz w:val="18"/>
-                <w:lang w:val="da-DK"/>
               </w:rPr>
               <w:t>Vise den valgte beboers aktuelle personlige pointsaldo.</w:t>
             </w:r>
@@ -586,16 +568,12 @@
           <w:p>
             <w:pPr>
               <w:spacing w:before="40" w:after="40"/>
-              <w:rPr>
-                <w:lang w:val="da-DK"/>
-              </w:rPr>
             </w:pPr>
             <w:r>
               <w:rPr>
                 <w:sz w:val="18"/>
-                <w:lang w:val="da-DK"/>
               </w:rPr>
-              <w:t>Beregne personlige point ud fra registrerede opgaver og pointforbrug, uden at saldoen bliver negativ.</w:t>
+              <w:t>Manuel korrigering af en beboers personlige point via en pointpostering, uden at saldoen kan blive negativ.</w:t>
             </w:r>
           </w:p>
         </w:tc>
@@ -670,14 +648,10 @@
           <w:p>
             <w:pPr>
               <w:spacing w:before="40" w:after="40"/>
-              <w:rPr>
-                <w:lang w:val="da-DK"/>
-              </w:rPr>
             </w:pPr>
             <w:r>
               <w:rPr>
                 <w:sz w:val="18"/>
-                <w:lang w:val="da-DK"/>
               </w:rPr>
               <w:t>Gemme beboere, opgaver og point lokalt og indlæse dem igen ved opstart.</w:t>
             </w:r>
@@ -714,16 +688,26 @@
           <w:p>
             <w:pPr>
               <w:spacing w:before="40" w:after="40"/>
-              <w:rPr>
-                <w:lang w:val="da-DK"/>
-              </w:rPr>
             </w:pPr>
             <w:r>
               <w:rPr>
                 <w:sz w:val="18"/>
-                <w:lang w:val="da-DK"/>
               </w:rPr>
-              <w:t>Have en informationshjemmeside om Kløverly og grøn inspiration uden private beboeroplysninger.</w:t>
+              <w:t xml:space="preserve">Have en informationshjemmeside om </w:t>
+            </w:r>
+            <w:proofErr w:type="spellStart"/>
+            <w:r>
+              <w:rPr>
+                <w:sz w:val="18"/>
+              </w:rPr>
+              <w:t>Kløverly</w:t>
+            </w:r>
+            <w:proofErr w:type="spellEnd"/>
+            <w:r>
+              <w:rPr>
+                <w:sz w:val="18"/>
+              </w:rPr>
+              <w:t xml:space="preserve"> og grøn inspiration uden private beboeroplysninger.</w:t>
             </w:r>
           </w:p>
         </w:tc>
@@ -758,16 +742,12 @@
           <w:p>
             <w:pPr>
               <w:spacing w:before="40" w:after="40"/>
-              <w:rPr>
-                <w:lang w:val="da-DK"/>
-              </w:rPr>
             </w:pPr>
             <w:r>
               <w:rPr>
                 <w:sz w:val="18"/>
-                <w:lang w:val="da-DK"/>
               </w:rPr>
-              <w:t>Registrere grønne tiltag og tilføje deres point til fællespuljen.</w:t>
+              <w:t>Oprette grønne tiltag som aktive opgaver. Når et grønt tiltag afsluttes, tilføjes dets point til fælles pointpuljen.</w:t>
             </w:r>
           </w:p>
         </w:tc>
@@ -802,60 +782,12 @@
           <w:p>
             <w:pPr>
               <w:spacing w:before="40" w:after="40"/>
-              <w:rPr>
-                <w:lang w:val="da-DK"/>
-              </w:rPr>
-            </w:pPr>
-            <w:r>
-              <w:rPr>
-                <w:sz w:val="18"/>
-                <w:lang w:val="da-DK"/>
-              </w:rPr>
-              <w:t>Registrere fællesopgaver, som giver en beboer personlige point.</w:t>
-            </w:r>
-          </w:p>
-        </w:tc>
-      </w:tr>
-      <w:tr>
-        <w:trPr>
-          <w:cantSplit/>
-          <w:jc w:val="center"/>
-        </w:trPr>
-        <w:tc>
-          <w:tcPr>
-            <w:tcW w:w="4929" w:type="dxa"/>
-            <w:vAlign w:val="center"/>
-          </w:tcPr>
-          <w:p>
-            <w:pPr>
-              <w:spacing w:before="40" w:after="40"/>
             </w:pPr>
             <w:r>
               <w:rPr>
                 <w:sz w:val="18"/>
               </w:rPr>
-              <w:t>FR16</w:t>
-            </w:r>
-          </w:p>
-        </w:tc>
-        <w:tc>
-          <w:tcPr>
-            <w:tcW w:w="4929" w:type="dxa"/>
-            <w:vAlign w:val="center"/>
-          </w:tcPr>
-          <w:p>
-            <w:pPr>
-              <w:spacing w:before="40" w:after="40"/>
-              <w:rPr>
-                <w:lang w:val="da-DK"/>
-              </w:rPr>
-            </w:pPr>
-            <w:r>
-              <w:rPr>
-                <w:sz w:val="18"/>
-                <w:lang w:val="da-DK"/>
-              </w:rPr>
-              <w:t>Registrere bytteopgaver, som trækker point fra en beboers personlige saldo.</w:t>
+              <w:t>Oprette fællesopgaver som aktive opgaver. Når en fællesopgave afsluttes, vælges udføreren, som modtager opgavens personlige point.</w:t>
             </w:r>
           </w:p>
         </w:tc>
@@ -879,6 +811,46 @@
                 <w:sz w:val="18"/>
               </w:rPr>
               <w:lastRenderedPageBreak/>
+              <w:t>FR16</w:t>
+            </w:r>
+          </w:p>
+        </w:tc>
+        <w:tc>
+          <w:tcPr>
+            <w:tcW w:w="4929" w:type="dxa"/>
+            <w:vAlign w:val="center"/>
+          </w:tcPr>
+          <w:p>
+            <w:pPr>
+              <w:spacing w:before="40" w:after="40"/>
+            </w:pPr>
+            <w:r>
+              <w:rPr>
+                <w:sz w:val="18"/>
+              </w:rPr>
+              <w:t>Oprette bytteopgaver, hvor bestilleren betaler med personlige point. Når opgaven afsluttes, modtager udføreren de tilsvarende point.</w:t>
+            </w:r>
+          </w:p>
+        </w:tc>
+      </w:tr>
+      <w:tr>
+        <w:trPr>
+          <w:cantSplit/>
+          <w:jc w:val="center"/>
+        </w:trPr>
+        <w:tc>
+          <w:tcPr>
+            <w:tcW w:w="4929" w:type="dxa"/>
+            <w:vAlign w:val="center"/>
+          </w:tcPr>
+          <w:p>
+            <w:pPr>
+              <w:spacing w:before="40" w:after="40"/>
+            </w:pPr>
+            <w:r>
+              <w:rPr>
+                <w:sz w:val="18"/>
+              </w:rPr>
               <w:t>FR17</w:t>
             </w:r>
           </w:p>
@@ -891,14 +863,10 @@
           <w:p>
             <w:pPr>
               <w:spacing w:before="40" w:after="40"/>
-              <w:rPr>
-                <w:lang w:val="da-DK"/>
-              </w:rPr>
             </w:pPr>
             <w:r>
               <w:rPr>
                 <w:sz w:val="18"/>
-                <w:lang w:val="da-DK"/>
               </w:rPr>
               <w:t>Hjemmesiden skal vise grønne tiltag anonymt, så beboere og eksterne besøgende kan finde inspiration uden at se personlige oplysninger.</w:t>
             </w:r>
@@ -935,16 +903,12 @@
           <w:p>
             <w:pPr>
               <w:spacing w:before="40" w:after="40"/>
-              <w:rPr>
-                <w:lang w:val="da-DK"/>
-              </w:rPr>
             </w:pPr>
             <w:r>
               <w:rPr>
                 <w:sz w:val="18"/>
-                <w:lang w:val="da-DK"/>
               </w:rPr>
-              <w:t>Nulstille en beboers personlige point efter brugerens bekræftelse og gemme ændringen i historikken.</w:t>
+              <w:t>Nulstille en beboers personlige point efter bekræftelse og gemme nulstillingen i historikken. Nulstilling må ikke gennemføres, hvis beboeren har en aktiv bytteopgave.</w:t>
             </w:r>
           </w:p>
         </w:tc>
@@ -979,16 +943,12 @@
           <w:p>
             <w:pPr>
               <w:spacing w:before="40" w:after="40"/>
-              <w:rPr>
-                <w:lang w:val="da-DK"/>
-              </w:rPr>
             </w:pPr>
             <w:r>
               <w:rPr>
                 <w:sz w:val="18"/>
-                <w:lang w:val="da-DK"/>
               </w:rPr>
-              <w:t>Vise en samlet rapportoversigt over registrerede opgaver og point.</w:t>
+              <w:t>Vise en samlet rapport med antal beboere, udførte opgaver, nuværende personlige point i alt, fælles pointpulje samt antal udførte opgaver pr. beboer.</w:t>
             </w:r>
           </w:p>
         </w:tc>
@@ -997,9 +957,6 @@
     <w:p>
       <w:pPr>
         <w:spacing w:after="0"/>
-        <w:rPr>
-          <w:lang w:val="da-DK"/>
-        </w:rPr>
       </w:pPr>
     </w:p>
     <w:p>
@@ -1094,14 +1051,10 @@
           <w:p>
             <w:pPr>
               <w:spacing w:before="40" w:after="40"/>
-              <w:rPr>
-                <w:lang w:val="da-DK"/>
-              </w:rPr>
             </w:pPr>
             <w:r>
               <w:rPr>
                 <w:sz w:val="18"/>
-                <w:lang w:val="da-DK"/>
               </w:rPr>
               <w:t>Programmet skal være enkelt at navigere i, med tydelige menuer for beboere, opgaver og point.</w:t>
             </w:r>
@@ -1138,14 +1091,10 @@
           <w:p>
             <w:pPr>
               <w:spacing w:before="40" w:after="40"/>
-              <w:rPr>
-                <w:lang w:val="da-DK"/>
-              </w:rPr>
             </w:pPr>
             <w:r>
               <w:rPr>
                 <w:sz w:val="18"/>
-                <w:lang w:val="da-DK"/>
               </w:rPr>
               <w:t>Ugyldige eller manglende indtastninger skal give en forståelig fejlbesked uden at lukke programmet.</w:t>
             </w:r>
@@ -1182,16 +1131,26 @@
           <w:p>
             <w:pPr>
               <w:spacing w:before="40" w:after="40"/>
-              <w:rPr>
-                <w:lang w:val="da-DK"/>
-              </w:rPr>
             </w:pPr>
             <w:r>
               <w:rPr>
                 <w:sz w:val="18"/>
-                <w:lang w:val="da-DK"/>
               </w:rPr>
-              <w:t>Ændringer skal kunne ses i programmets oversigter efter gemning.</w:t>
+              <w:t xml:space="preserve">Ændringer skal kunne ses i programmets oversigter efter </w:t>
+            </w:r>
+            <w:proofErr w:type="spellStart"/>
+            <w:r>
+              <w:rPr>
+                <w:sz w:val="18"/>
+              </w:rPr>
+              <w:t>gemning</w:t>
+            </w:r>
+            <w:proofErr w:type="spellEnd"/>
+            <w:r>
+              <w:rPr>
+                <w:sz w:val="18"/>
+              </w:rPr>
+              <w:t>.</w:t>
             </w:r>
           </w:p>
         </w:tc>
@@ -1226,14 +1185,10 @@
           <w:p>
             <w:pPr>
               <w:spacing w:before="40" w:after="40"/>
-              <w:rPr>
-                <w:lang w:val="da-DK"/>
-              </w:rPr>
             </w:pPr>
             <w:r>
               <w:rPr>
                 <w:sz w:val="18"/>
-                <w:lang w:val="da-DK"/>
               </w:rPr>
               <w:t>Gemte oplysninger skal fortsat være tilgængelige efter genstart.</w:t>
             </w:r>
@@ -1270,14 +1225,10 @@
           <w:p>
             <w:pPr>
               <w:spacing w:before="40" w:after="40"/>
-              <w:rPr>
-                <w:lang w:val="da-DK"/>
-              </w:rPr>
             </w:pPr>
             <w:r>
               <w:rPr>
                 <w:sz w:val="18"/>
-                <w:lang w:val="da-DK"/>
               </w:rPr>
               <w:t>Administrationsprogrammet skal kunne bruges lokalt uden login eller internetforbindelse.</w:t>
             </w:r>
@@ -1314,16 +1265,12 @@
           <w:p>
             <w:pPr>
               <w:spacing w:before="40" w:after="40"/>
-              <w:rPr>
-                <w:lang w:val="da-DK"/>
-              </w:rPr>
             </w:pPr>
             <w:r>
               <w:rPr>
                 <w:sz w:val="18"/>
-                <w:lang w:val="da-DK"/>
               </w:rPr>
-              <w:t>Hjemmesiden og den anonyme skærmvisning må ikke vise navne, individuelle pointsaldi eller andre oplysninger, der identificerer beboerne.</w:t>
+              <w:t>Hjemmesiden må ikke vise beboernavne, individuelle pointsaldi eller andre oplysninger, der identificerer beboerne i forbindelse med de grønne tiltag.</w:t>
             </w:r>
           </w:p>
         </w:tc>
@@ -1332,76 +1279,62 @@
     <w:p>
       <w:pPr>
         <w:spacing w:after="0"/>
-        <w:rPr>
-          <w:lang w:val="da-DK"/>
-        </w:rPr>
       </w:pPr>
     </w:p>
     <w:p>
       <w:pPr>
         <w:pStyle w:val="Overskrift1"/>
-        <w:rPr>
-          <w:lang w:val="da-DK"/>
-        </w:rPr>
       </w:pPr>
       <w:r>
-        <w:rPr>
-          <w:lang w:val="da-DK"/>
-        </w:rPr>
         <w:t>4. Sporbarhed og kontrol</w:t>
+      </w:r>
+    </w:p>
+    <w:p>
+      <w:r>
+        <w:t xml:space="preserve">Hvert funktionelt krav skal forbindes med mindst én </w:t>
+      </w:r>
+      <w:proofErr w:type="spellStart"/>
+      <w:r>
+        <w:t>use</w:t>
+      </w:r>
+      <w:proofErr w:type="spellEnd"/>
+      <w:r>
+        <w:t xml:space="preserve"> case eller en tydeligt dokumenteret funktion og med en test. I de næste dokumenter bruger vi samme FR-numre, så man kan følge et krav fra analyse til implementering og afprøvning.</w:t>
       </w:r>
     </w:p>
     <w:p>
       <w:pPr>
         <w:rPr>
-          <w:lang w:val="da-DK"/>
+          <w:b/>
+          <w:bCs/>
         </w:rPr>
       </w:pPr>
       <w:r>
-        <w:rPr>
-          <w:lang w:val="da-DK"/>
-        </w:rPr>
-        <w:t>Hvert funktionelt krav skal forbindes med mindst én use case eller en tydeligt dokumenteret funktion og med en test. I de næste dokumenter bruger vi samme FR-numre, så man kan følge et krav fra analyse til implementering og afprøvning.</w:t>
-      </w:r>
-    </w:p>
-    <w:p>
-      <w:pPr>
-        <w:rPr>
-          <w:lang w:val="da-DK"/>
-        </w:rPr>
-      </w:pPr>
-      <w:r>
-        <w:rPr>
-          <w:lang w:val="da-DK"/>
-        </w:rPr>
-        <w:t>Eksempel: FR05 → UC Opret opgave → aktivitets-/sekvensdiagram → Java-kode → test af oprettelse. FR13 og FR17 bliver dokumenteret og testet særskilt, fordi de vedrører hjemmesiden og ekstern skærmvisning.</w:t>
+        <w:t>Eksempel: FR05 → UC Opret opgave → aktivitets-/sekvensdiagram → Java-kode → test af oprettelse. FR13 og FR17 bliver dokumenteret og testet særskilt, fordi de vedrører hjemmesiden og visning af offentlig information og anonyme grønne tiltag.</w:t>
       </w:r>
     </w:p>
     <w:p>
       <w:pPr>
         <w:pStyle w:val="Overskrift1"/>
-        <w:rPr>
-          <w:lang w:val="da-DK"/>
-        </w:rPr>
       </w:pPr>
       <w:r>
-        <w:rPr>
-          <w:lang w:val="da-DK"/>
-        </w:rPr>
         <w:t>5. Grundlag</w:t>
       </w:r>
     </w:p>
     <w:p>
-      <w:pPr>
-        <w:rPr>
-          <w:lang w:val="da-DK"/>
-        </w:rPr>
-      </w:pPr>
       <w:r>
-        <w:rPr>
-          <w:lang w:val="da-DK"/>
-        </w:rPr>
-        <w:t>Kravene bygger på Kløverly-casen (2025), fælles brainstorm og aktører samt vores to tidligere SEP1-projekter. De nye krav FR14–FR19 udvider den oprindelige funktionsliste og skal derfor også gennemføres i det fælles projekt.</w:t>
+        <w:t xml:space="preserve">Kravene bygger på </w:t>
+      </w:r>
+      <w:proofErr w:type="spellStart"/>
+      <w:r>
+        <w:t>Kløverly</w:t>
+      </w:r>
+      <w:proofErr w:type="spellEnd"/>
+      <w:r>
+        <w:t xml:space="preserve">-casen (2025), fælles brainstorm og aktører samt vores to tidligere SEP1-projekter. </w:t>
+      </w:r>
+      <w:r>
+        <w:t>De nye krav FR14–FR19 udvider den oprindelige funktionsliste og indgår derfor også i det fælles projekt.</w:t>
       </w:r>
     </w:p>
     <w:sectPr>
@@ -1448,7 +1381,15 @@
       <w:jc w:val="center"/>
     </w:pPr>
     <w:r>
-      <w:t>SEP1 · Kløverly · Kravspecifikation</w:t>
+      <w:t xml:space="preserve">SEP1 · </w:t>
+    </w:r>
+    <w:proofErr w:type="spellStart"/>
+    <w:r>
+      <w:t>Kløverly</w:t>
+    </w:r>
+    <w:proofErr w:type="spellEnd"/>
+    <w:r>
+      <w:t xml:space="preserve"> · Kravspecifikation</w:t>
     </w:r>
   </w:p>
 </w:ftr>
@@ -2078,6 +2019,7 @@
     <w:rPr>
       <w:rFonts w:ascii="Aptos" w:hAnsi="Aptos"/>
       <w:sz w:val="20"/>
+      <w:lang w:val="da-DK"/>
     </w:rPr>
   </w:style>
   <w:style w:type="paragraph" w:styleId="Overskrift1">
@@ -2290,7 +2232,6 @@
   <w:style w:type="character" w:default="1" w:styleId="Standardskrifttypeiafsnit">
     <w:name w:val="Default Paragraph Font"/>
     <w:uiPriority w:val="1"/>
-    <w:semiHidden/>
     <w:unhideWhenUsed/>
   </w:style>
   <w:style w:type="table" w:default="1" w:styleId="Tabel-Normal">

</xml_diff>